<commit_message>
Updates over snow week
Chap. 2.1
Sim work
Chap. 4 work
</commit_message>
<xml_diff>
--- a/docs/lectures/Chapter02_Lecture.docx
+++ b/docs/lectures/Chapter02_Lecture.docx
@@ -23,7 +23,7 @@
         <w:pStyle w:val="Date"/>
       </w:pPr>
       <w:r>
-        <w:t xml:space="preserve">2026-01-22</w:t>
+        <w:t xml:space="preserve">2026-01-29</w:t>
       </w:r>
     </w:p>
     <w:sdt>
@@ -58,7 +58,7 @@
         <w:pStyle w:val="Heading1"/>
       </w:pPr>
       <w:r>
-        <w:t xml:space="preserve">1. Introduction</w:t>
+        <w:t xml:space="preserve">2. Introduction</w:t>
       </w:r>
     </w:p>
     <w:p>
@@ -256,7 +256,7 @@
         <w:pStyle w:val="Heading2"/>
       </w:pPr>
       <w:r>
-        <w:t xml:space="preserve">1.1 History of the International Monetary System</w:t>
+        <w:t xml:space="preserve">2.1 History of the International Monetary System</w:t>
       </w:r>
     </w:p>
     <w:p>
@@ -289,7 +289,7 @@
       <w:r>
         <w:drawing>
           <wp:inline>
-            <wp:extent cx="4533900" cy="3410112"/>
+            <wp:extent cx="3733800" cy="2808328"/>
             <wp:effectExtent b="0" l="0" r="0" t="0"/>
             <wp:docPr descr="The Evolution of the Global Monetary System" title="" id="22" name="Picture"/>
             <a:graphic>
@@ -310,7 +310,7 @@
                   <pic:spPr bwMode="auto">
                     <a:xfrm>
                       <a:off x="0" y="0"/>
-                      <a:ext cx="4533900" cy="3410112"/>
+                      <a:ext cx="3733800" cy="2808328"/>
                     </a:xfrm>
                     <a:prstGeom prst="rect">
                       <a:avLst/>
@@ -343,7 +343,7 @@
         <w:pStyle w:val="Heading3"/>
       </w:pPr>
       <w:r>
-        <w:t xml:space="preserve">1.1.1 The Classical Gold Standard (1879-1913)</w:t>
+        <w:t xml:space="preserve">2.1.1 The Classical Gold Standard (1879-1913)</w:t>
       </w:r>
     </w:p>
     <w:p>
@@ -474,7 +474,7 @@
         <w:pStyle w:val="Heading3"/>
       </w:pPr>
       <w:r>
-        <w:t xml:space="preserve">1.1.2 The Interwar Years and World War II (1914-1944)</w:t>
+        <w:t xml:space="preserve">2.1.2 The Interwar Years and World War II (1914-1944)</w:t>
       </w:r>
     </w:p>
     <w:p>
@@ -550,7 +550,7 @@
         <w:pStyle w:val="Heading3"/>
       </w:pPr>
       <w:r>
-        <w:t xml:space="preserve">1.1.3 Bretton Woods and the International Monetary Fund (1944)</w:t>
+        <w:t xml:space="preserve">2.1.3 Bretton Woods and the International Monetary Fund (1944)</w:t>
       </w:r>
     </w:p>
     <w:p>
@@ -779,7 +779,7 @@
         <w:pStyle w:val="Heading4"/>
       </w:pPr>
       <w:r>
-        <w:t xml:space="preserve">1.1.3.1 Special Drawing Right (SDR)</w:t>
+        <w:t xml:space="preserve">2.1.3.1 Special Drawing Right (SDR)</w:t>
       </w:r>
     </w:p>
     <w:p>
@@ -798,7 +798,7 @@
         <w:pStyle w:val="Heading3"/>
       </w:pPr>
       <w:r>
-        <w:t xml:space="preserve">1.1.4 Fixed Exchange Rates (1945–1973)</w:t>
+        <w:t xml:space="preserve">2.1.4 Fixed Exchange Rates (1945–1973)</w:t>
       </w:r>
     </w:p>
     <w:p>
@@ -854,7 +854,7 @@
         <w:pStyle w:val="Heading3"/>
       </w:pPr>
       <w:r>
-        <w:t xml:space="preserve">1.1.5 Floating Exchange Rates (1973–1997)</w:t>
+        <w:t xml:space="preserve">2.1.5 Floating Exchange Rates (1973–1997)</w:t>
       </w:r>
     </w:p>
     <w:p>
@@ -880,7 +880,7 @@
         <w:pStyle w:val="Heading3"/>
       </w:pPr>
       <w:r>
-        <w:t xml:space="preserve">1.1.6 The Emerging Era (1997–Present)</w:t>
+        <w:t xml:space="preserve">2.1.6 The Emerging Era (1997–Present)</w:t>
       </w:r>
     </w:p>
     <w:p>
@@ -905,7 +905,7 @@
         <w:pStyle w:val="Heading3"/>
       </w:pPr>
       <w:r>
-        <w:t xml:space="preserve">1.1.7 IMF Classification of Currency Regimes</w:t>
+        <w:t xml:space="preserve">2.1.7 IMF Classification of Currency Regimes</w:t>
       </w:r>
     </w:p>
     <w:p>
@@ -923,7 +923,7 @@
         <w:pStyle w:val="Heading3"/>
       </w:pPr>
       <w:r>
-        <w:t xml:space="preserve">1.1.8 The IMF’s De Facto System</w:t>
+        <w:t xml:space="preserve">2.1.8 The IMF’s De Facto System</w:t>
       </w:r>
     </w:p>
     <w:p>
@@ -945,7 +945,7 @@
       <w:r>
         <w:drawing>
           <wp:inline>
-            <wp:extent cx="4533900" cy="4311080"/>
+            <wp:extent cx="3733800" cy="3550301"/>
             <wp:effectExtent b="0" l="0" r="0" t="0"/>
             <wp:docPr descr="IMF Exchange Rate Classifications" title="" id="33" name="Picture"/>
             <a:graphic>
@@ -966,7 +966,7 @@
                   <pic:spPr bwMode="auto">
                     <a:xfrm>
                       <a:off x="0" y="0"/>
-                      <a:ext cx="4533900" cy="4311080"/>
+                      <a:ext cx="3733800" cy="3550301"/>
                     </a:xfrm>
                     <a:prstGeom prst="rect">
                       <a:avLst/>
@@ -1182,7 +1182,7 @@
       <w:r>
         <w:drawing>
           <wp:inline>
-            <wp:extent cx="4533900" cy="3410112"/>
+            <wp:extent cx="3733800" cy="2808328"/>
             <wp:effectExtent b="0" l="0" r="0" t="0"/>
             <wp:docPr descr="Taxonomy of Exchange Rate Regimes" title="" id="36" name="Picture"/>
             <a:graphic>
@@ -1203,7 +1203,7 @@
                   <pic:spPr bwMode="auto">
                     <a:xfrm>
                       <a:off x="0" y="0"/>
-                      <a:ext cx="4533900" cy="3410112"/>
+                      <a:ext cx="3733800" cy="2808328"/>
                     </a:xfrm>
                     <a:prstGeom prst="rect">
                       <a:avLst/>
@@ -1237,7 +1237,7 @@
         <w:pStyle w:val="Heading3"/>
       </w:pPr>
       <w:r>
-        <w:t xml:space="preserve">1.1.9 A Global Eclectic</w:t>
+        <w:t xml:space="preserve">2.1.9 A Global Eclectic</w:t>
       </w:r>
     </w:p>
     <w:p>
@@ -1293,7 +1293,7 @@
         <w:pStyle w:val="Heading2"/>
       </w:pPr>
       <w:r>
-        <w:t xml:space="preserve">1.2 Fixed vs. Flexible Exchange Rates</w:t>
+        <w:t xml:space="preserve">2.2 Fixed vs. Flexible Exchange Rates</w:t>
       </w:r>
     </w:p>
     <w:p>
@@ -1336,7 +1336,7 @@
         <w:pStyle w:val="Heading2"/>
       </w:pPr>
       <w:r>
-        <w:t xml:space="preserve">1.3 The Impossible Trinity</w:t>
+        <w:t xml:space="preserve">2.3 The Impossible Trinity</w:t>
       </w:r>
     </w:p>
     <w:p>
@@ -1361,7 +1361,7 @@
         <w:pStyle w:val="Heading3"/>
       </w:pPr>
       <w:r>
-        <w:t xml:space="preserve">1.3.1 The Core Framework</w:t>
+        <w:t xml:space="preserve">2.3.1 The Core Framework</w:t>
       </w:r>
     </w:p>
     <w:p>
@@ -1401,7 +1401,7 @@
       <w:r>
         <w:drawing>
           <wp:inline>
-            <wp:extent cx="4533900" cy="3410112"/>
+            <wp:extent cx="3733800" cy="2808328"/>
             <wp:effectExtent b="0" l="0" r="0" t="0"/>
             <wp:docPr descr="The Evolution of the Global Monetary System" title="" id="43" name="Picture"/>
             <a:graphic>
@@ -1422,7 +1422,7 @@
                   <pic:spPr bwMode="auto">
                     <a:xfrm>
                       <a:off x="0" y="0"/>
-                      <a:ext cx="4533900" cy="3410112"/>
+                      <a:ext cx="3733800" cy="2808328"/>
                     </a:xfrm>
                     <a:prstGeom prst="rect">
                       <a:avLst/>
@@ -1618,7 +1618,7 @@
         <w:pStyle w:val="Heading2"/>
       </w:pPr>
       <w:r>
-        <w:t xml:space="preserve">1.4 A Single Currency for Europe: The Euro</w:t>
+        <w:t xml:space="preserve">2.4 A Single Currency for Europe: The Euro</w:t>
       </w:r>
     </w:p>
     <w:bookmarkStart w:id="47" w:name="creation-timeline"/>
@@ -1627,7 +1627,7 @@
         <w:pStyle w:val="Heading3"/>
       </w:pPr>
       <w:r>
-        <w:t xml:space="preserve">1.4.1 Creation Timeline</w:t>
+        <w:t xml:space="preserve">2.4.1 Creation Timeline</w:t>
       </w:r>
     </w:p>
     <w:p>
@@ -1697,7 +1697,7 @@
         <w:pStyle w:val="Heading3"/>
       </w:pPr>
       <w:r>
-        <w:t xml:space="preserve">1.4.2 The Maastricht Treaty and Monetary Union</w:t>
+        <w:t xml:space="preserve">2.4.2 The Maastricht Treaty and Monetary Union</w:t>
       </w:r>
     </w:p>
     <w:p>
@@ -1723,7 +1723,7 @@
         <w:pStyle w:val="Heading3"/>
       </w:pPr>
       <w:r>
-        <w:t xml:space="preserve">1.4.3 European Central Bank (ECB)</w:t>
+        <w:t xml:space="preserve">2.4.3 European Central Bank (ECB)</w:t>
       </w:r>
     </w:p>
     <w:p>
@@ -1789,7 +1789,7 @@
         <w:pStyle w:val="Heading3"/>
       </w:pPr>
       <w:r>
-        <w:t xml:space="preserve">1.4.4 The Launch of the Euro</w:t>
+        <w:t xml:space="preserve">2.4.4 The Launch of the Euro</w:t>
       </w:r>
     </w:p>
     <w:p>
@@ -1815,7 +1815,7 @@
         <w:pStyle w:val="Heading3"/>
       </w:pPr>
       <w:r>
-        <w:t xml:space="preserve">1.4.5 Benefits</w:t>
+        <w:t xml:space="preserve">2.4.5 Benefits</w:t>
       </w:r>
     </w:p>
     <w:p>
@@ -1885,7 +1885,7 @@
         <w:pStyle w:val="Heading3"/>
       </w:pPr>
       <w:r>
-        <w:t xml:space="preserve">1.4.6 Challenges</w:t>
+        <w:t xml:space="preserve">2.4.6 Challenges</w:t>
       </w:r>
     </w:p>
     <w:p>
@@ -2089,7 +2089,7 @@
         <w:pStyle w:val="Heading3"/>
       </w:pPr>
       <w:r>
-        <w:t xml:space="preserve">1.4.7 Greek Crisis Case Study</w:t>
+        <w:t xml:space="preserve">2.4.7 Greek Crisis Case Study</w:t>
       </w:r>
     </w:p>
     <w:p>
@@ -2197,7 +2197,7 @@
         <w:pStyle w:val="Heading2"/>
       </w:pPr>
       <w:r>
-        <w:t xml:space="preserve">1.5 Internationalization of the Chinese RMB</w:t>
+        <w:t xml:space="preserve">2.5 Internationalization of the Chinese RMB</w:t>
       </w:r>
     </w:p>
     <w:bookmarkStart w:id="55" w:name="renminbi-valuation"/>
@@ -2206,7 +2206,7 @@
         <w:pStyle w:val="Heading3"/>
       </w:pPr>
       <w:r>
-        <w:t xml:space="preserve">1.5.1 Renminbi Valuation</w:t>
+        <w:t xml:space="preserve">2.5.1 Renminbi Valuation</w:t>
       </w:r>
     </w:p>
     <w:p>
@@ -2224,7 +2224,7 @@
         <w:pStyle w:val="Heading3"/>
       </w:pPr>
       <w:r>
-        <w:t xml:space="preserve">1.5.2 Two-Market Currency Development</w:t>
+        <w:t xml:space="preserve">2.5.2 Two-Market Currency Development</w:t>
       </w:r>
     </w:p>
     <w:p>
@@ -2287,7 +2287,7 @@
         <w:pStyle w:val="Heading3"/>
       </w:pPr>
       <w:r>
-        <w:t xml:space="preserve">1.5.3 Internationalization: Theoretical Principles and Practical Concerns</w:t>
+        <w:t xml:space="preserve">2.5.3 Internationalization: Theoretical Principles and Practical Concerns</w:t>
       </w:r>
     </w:p>
     <w:p>
@@ -2359,7 +2359,7 @@
         <w:pStyle w:val="Heading3"/>
       </w:pPr>
       <w:r>
-        <w:t xml:space="preserve">1.5.4 Triffin Dilemma</w:t>
+        <w:t xml:space="preserve">2.5.4 Triffin Dilemma</w:t>
       </w:r>
     </w:p>
     <w:p>
@@ -2413,7 +2413,7 @@
         <w:pStyle w:val="Heading3"/>
       </w:pPr>
       <w:r>
-        <w:t xml:space="preserve">1.5.5 Currency Trading Hubs</w:t>
+        <w:t xml:space="preserve">2.5.5 Currency Trading Hubs</w:t>
       </w:r>
     </w:p>
     <w:p>
@@ -2442,7 +2442,7 @@
         <w:pStyle w:val="Heading2"/>
       </w:pPr>
       <w:r>
-        <w:t xml:space="preserve">1.6 Emerging Markets and Regime Choices</w:t>
+        <w:t xml:space="preserve">2.6 Emerging Markets and Regime Choices</w:t>
       </w:r>
     </w:p>
     <w:bookmarkStart w:id="62" w:name="currency-boards"/>
@@ -2451,7 +2451,7 @@
         <w:pStyle w:val="Heading3"/>
       </w:pPr>
       <w:r>
-        <w:t xml:space="preserve">1.6.1 Currency Boards</w:t>
+        <w:t xml:space="preserve">2.6.1 Currency Boards</w:t>
       </w:r>
     </w:p>
     <w:bookmarkStart w:id="61" w:name="argentina"/>
@@ -2460,7 +2460,7 @@
         <w:pStyle w:val="Heading4"/>
       </w:pPr>
       <w:r>
-        <w:t xml:space="preserve">1.6.1.1 Argentina</w:t>
+        <w:t xml:space="preserve">2.6.1.1 Argentina</w:t>
       </w:r>
     </w:p>
     <w:p>
@@ -2551,7 +2551,7 @@
         <w:pStyle w:val="Heading3"/>
       </w:pPr>
       <w:r>
-        <w:t xml:space="preserve">1.6.2 Dollarization</w:t>
+        <w:t xml:space="preserve">2.6.2 Dollarization</w:t>
       </w:r>
     </w:p>
     <w:p>
@@ -2568,7 +2568,7 @@
         <w:pStyle w:val="Heading4"/>
       </w:pPr>
       <w:r>
-        <w:t xml:space="preserve">1.6.2.1 Ecuador</w:t>
+        <w:t xml:space="preserve">2.6.2.1 Ecuador</w:t>
       </w:r>
     </w:p>
     <w:p>
@@ -2598,7 +2598,7 @@
         <w:pStyle w:val="Heading4"/>
       </w:pPr>
       <w:r>
-        <w:t xml:space="preserve">1.6.2.2 El Salvador</w:t>
+        <w:t xml:space="preserve">2.6.2.2 El Salvador</w:t>
       </w:r>
     </w:p>
     <w:p>
@@ -2644,7 +2644,7 @@
         <w:pStyle w:val="Heading4"/>
       </w:pPr>
       <w:r>
-        <w:t xml:space="preserve">1.6.2.3 Zimbabwe</w:t>
+        <w:t xml:space="preserve">2.6.2.3 Zimbabwe</w:t>
       </w:r>
     </w:p>
     <w:p>
@@ -2693,7 +2693,7 @@
         <w:pStyle w:val="Heading3"/>
       </w:pPr>
       <w:r>
-        <w:t xml:space="preserve">1.6.3 Currency Regime Choices for Emerging Markets</w:t>
+        <w:t xml:space="preserve">2.6.3 Currency Regime Choices for Emerging Markets</w:t>
       </w:r>
     </w:p>
     <w:p>
@@ -2798,7 +2798,7 @@
         <w:pStyle w:val="Heading2"/>
       </w:pPr>
       <w:r>
-        <w:t xml:space="preserve">1.7 Reserve Currencies &amp; What Lies Ahead</w:t>
+        <w:t xml:space="preserve">2.7 Reserve Currencies &amp; What Lies Ahead</w:t>
       </w:r>
     </w:p>
     <w:bookmarkStart w:id="69" w:name="current-landscape"/>
@@ -2807,7 +2807,7 @@
         <w:pStyle w:val="Heading3"/>
       </w:pPr>
       <w:r>
-        <w:t xml:space="preserve">1.7.1 Current Landscape</w:t>
+        <w:t xml:space="preserve">2.7.1 Current Landscape</w:t>
       </w:r>
     </w:p>
     <w:p>
@@ -2877,7 +2877,7 @@
         <w:pStyle w:val="Heading3"/>
       </w:pPr>
       <w:r>
-        <w:t xml:space="preserve">1.7.2 Why Dollar Dominance</w:t>
+        <w:t xml:space="preserve">2.7.2 Why Dollar Dominance</w:t>
       </w:r>
     </w:p>
     <w:p>
@@ -2959,7 +2959,7 @@
         <w:pStyle w:val="Heading3"/>
       </w:pPr>
       <w:r>
-        <w:t xml:space="preserve">1.7.3 Challenges</w:t>
+        <w:t xml:space="preserve">2.7.3 Challenges</w:t>
       </w:r>
     </w:p>
     <w:p>
@@ -3023,7 +3023,7 @@
         <w:pStyle w:val="Heading3"/>
       </w:pPr>
       <w:r>
-        <w:t xml:space="preserve">1.7.4 Digital Yuan (e-CNY)</w:t>
+        <w:t xml:space="preserve">2.7.4 Digital Yuan (e-CNY)</w:t>
       </w:r>
     </w:p>
     <w:p>
@@ -3087,7 +3087,7 @@
         <w:pStyle w:val="Heading3"/>
       </w:pPr>
       <w:r>
-        <w:t xml:space="preserve">1.7.5 Impact on International System</w:t>
+        <w:t xml:space="preserve">2.7.5 Impact on International System</w:t>
       </w:r>
     </w:p>
     <w:p>
@@ -3146,7 +3146,7 @@
         <w:pStyle w:val="Heading2"/>
       </w:pPr>
       <w:r>
-        <w:t xml:space="preserve">1.8 Conclusion</w:t>
+        <w:t xml:space="preserve">2.8 Conclusion</w:t>
       </w:r>
     </w:p>
     <w:bookmarkStart w:id="75" w:name="five-key-lessons"/>
@@ -3155,7 +3155,7 @@
         <w:pStyle w:val="Heading3"/>
       </w:pPr>
       <w:r>
-        <w:t xml:space="preserve">1.8.1 Five Key Lessons</w:t>
+        <w:t xml:space="preserve">2.8.1 Five Key Lessons</w:t>
       </w:r>
     </w:p>
     <w:p>
@@ -3384,7 +3384,7 @@
         <w:pStyle w:val="Heading3"/>
       </w:pPr>
       <w:r>
-        <w:t xml:space="preserve">1.8.2 Questions to think about:</w:t>
+        <w:t xml:space="preserve">2.8.2 Questions to think about:</w:t>
       </w:r>
     </w:p>
     <w:p>

</xml_diff>